<commit_message>
docs: update all docs for v2.15.1 + v2.16.0 complete; fix silent except in logger/security
Documentation:
- PRD.md — version header → 2.16.0 (complete); full v2.16.0 section with all 5 phases,
  commit hashes, test counts, and summary table
- DESIGN_PATTERN_LIBRARY.md — status → ✅ Complete (v2.16.0); all phase sections updated
- Changelog.docx — v2.16.0 FEAT row + v2.15.1 FIX row added; commit count updated to
  89 commits · 16 days · Feb 23 – Mar 10, 2026
- Internal Overview.docx — new KEY CAPABILITIES row: Config-Driven Pattern Library (v2.16.0)
  + Security Hardening (v2.15.1)

Quality fixes (silent-except cleanup):
- logger.py — three bare `except: pass` blocks now write to stderr with exc detail
- security_knowledge.py — two bare `except: pass` blocks now log at DEBUG level

Co-Authored-By: Claude Sonnet 4.6 <noreply@anthropic.com>
</commit_message>
<xml_diff>
--- a/docs/Informatica Conversion Tool - Changelog.docx
+++ b/docs/Informatica Conversion Tool - Changelog.docx
@@ -36,7 +36,7 @@
           <w:sz w:val="20"/>
           <w:szCs w:val="20"/>
         </w:rPr>
-        <w:t xml:space="preserve">83 commits  ·  10 days  ·  Feb 23 – Mar 4, 2026</w:t>
+        <w:t xml:space="preserve">89 commits  ·  16 days  ·  Feb 23 – Mar 10, 2026</w:t>
       </w:r>
     </w:p>
     <w:p>
@@ -557,6 +557,340 @@
                 <w:szCs w:val="24"/>
               </w:rPr>
               <w:t xml:space="preserve">4</w:t>
+            </w:r>
+          </w:p>
+        </w:tc>
+      </w:tr>
+    </w:tbl>
+    <w:p>
+      <w:pPr>
+        <w:spacing w:after="240"/>
+      </w:pPr>
+    </w:p>
+    <w:p>
+      <w:pPr>
+        <w:pBdr>
+          <w:bottom w:val="single" w:color="1A7A4A" w:sz="6" w:space="4"/>
+        </w:pBdr>
+        <w:spacing w:before="320" w:after="160"/>
+      </w:pPr>
+      <w:r>
+        <w:rPr>
+          <w:rFonts w:ascii="Arial" w:cs="Arial" w:eastAsia="Arial" w:hAnsi="Arial"/>
+          <w:b/>
+          <w:bCs/>
+          <w:color w:val="1E3A5F"/>
+          <w:sz w:val="28"/>
+          <w:szCs w:val="28"/>
+        </w:rPr>
+        <w:t xml:space="preserve">v2.16.0 — Config-Driven Pattern Library</w:t>
+      </w:r>
+      <w:r>
+        <w:rPr>
+          <w:rFonts w:ascii="Arial" w:cs="Arial" w:eastAsia="Arial" w:hAnsi="Arial"/>
+          <w:color w:val="6B7280"/>
+          <w:sz w:val="20"/>
+          <w:szCs w:val="20"/>
+        </w:rPr>
+        <w:t xml:space="preserve">  ·  March 10, 2026  ·  3b43411 (Phase 5 / final)</w:t>
+      </w:r>
+    </w:p>
+    <w:tbl>
+      <w:tblPr>
+        <w:tblStyle w:val="TableGrid"/>
+        <w:tblW w:type="dxa" w:w="9360"/>
+        <w:tblBorders>
+          <w:top w:val="none" w:sz="0" w:space="0" w:color="auto"/>
+          <w:left w:val="none" w:sz="0" w:space="0" w:color="auto"/>
+          <w:bottom w:val="none" w:sz="0" w:space="0" w:color="auto"/>
+          <w:right w:val="none" w:sz="0" w:space="0" w:color="auto"/>
+          <w:insideH w:val="single" w:sz="4" w:space="0" w:color="E5E7EB"/>
+          <w:insideV w:val="none" w:sz="0" w:space="0" w:color="auto"/>
+        </w:tblBorders>
+        <w:tblCellMar>
+          <w:top w:type="dxa" w:w="80"/>
+          <w:left w:type="dxa" w:w="120"/>
+          <w:bottom w:type="dxa" w:w="80"/>
+          <w:right w:type="dxa" w:w="120"/>
+        </w:tblCellMar>
+      </w:tblPr>
+      <w:tblGrid>
+        <w:gridCol w:w="1200"/>
+        <w:gridCol w:w="8160"/>
+      </w:tblGrid>
+      <w:tr>
+        <w:tc>
+          <w:tcPr>
+            <w:tcW w:type="dxa" w:w="1200"/>
+            <w:shd w:val="clear" w:color="auto" w:fill="EFF6FF"/>
+            <w:tcMar>
+              <w:top w:type="dxa" w:w="80"/>
+              <w:left w:type="dxa" w:w="120"/>
+              <w:bottom w:type="dxa" w:w="80"/>
+              <w:right w:type="dxa" w:w="120"/>
+            </w:tcMar>
+          </w:tcPr>
+          <w:p>
+            <w:r>
+              <w:rPr>
+                <w:rFonts w:ascii="Arial" w:cs="Arial" w:eastAsia="Arial" w:hAnsi="Arial"/>
+                <w:b/>
+                <w:bCs/>
+                <w:color w:val="1E3A5F"/>
+                <w:sz w:val="18"/>
+                <w:szCs w:val="18"/>
+              </w:rPr>
+              <w:t>FEAT</w:t>
+            </w:r>
+          </w:p>
+        </w:tc>
+        <w:tc>
+          <w:tcPr>
+            <w:tcW w:type="dxa" w:w="8160"/>
+            <w:tcMar>
+              <w:top w:type="dxa" w:w="80"/>
+              <w:left w:type="dxa" w:w="120"/>
+              <w:bottom w:type="dxa" w:w="80"/>
+              <w:right w:type="dxa" w:w="120"/>
+            </w:tcMar>
+          </w:tcPr>
+          <w:p>
+            <w:r>
+              <w:rPr>
+                <w:rFonts w:ascii="Arial" w:cs="Arial" w:eastAsia="Arial" w:hAnsi="Arial"/>
+                <w:b/>
+                <w:bCs/>
+                <w:sz w:val="20"/>
+                <w:szCs w:val="20"/>
+              </w:rPr>
+              <w:t>10-pattern config-driven ETL library (etl_patterns) — all 5 phases complete, 199/199 tests</w:t>
+            </w:r>
+          </w:p>
+          <w:p>
+            <w:r>
+              <w:rPr>
+                <w:rFonts w:ascii="Arial" w:cs="Arial" w:eastAsia="Arial" w:hAnsi="Arial"/>
+                <w:sz w:val="18"/>
+                <w:szCs w:val="18"/>
+              </w:rPr>
+              <w:t xml:space="preserve">A pip-installable Python package (etl_patterns/) where each of the 10 recognised Informatica mapping patterns is a pre-built, tested library component driven by a YAML config. Replaces bespoke LLM-generated code for the majority of the mapping estate with deterministic, maintainable runtime logic.</w:t>
+            </w:r>
+          </w:p>
+          <w:p>
+            <w:r>
+              <w:rPr>
+                <w:rFonts w:ascii="Arial" w:cs="Arial" w:eastAsia="Arial" w:hAnsi="Arial"/>
+                <w:b/>
+                <w:bCs/>
+                <w:sz w:val="18"/>
+                <w:szCs w:val="18"/>
+              </w:rPr>
+              <w:t>Phase 1 (commit b8f8d77, 84 tests)</w:t>
+            </w:r>
+            <w:r>
+              <w:rPr>
+                <w:rFonts w:ascii="Arial" w:cs="Arial" w:eastAsia="Arial" w:hAnsi="Arial"/>
+                <w:sz w:val="18"/>
+                <w:szCs w:val="18"/>
+              </w:rPr>
+              <w:t xml:space="preserve">  —  Full infrastructure: exception hierarchy, shared utilities (etl_metadata, null_safe, type_cast, string_clean, watermark_manager, file_lifecycle), IO abstraction layer (DatabaseReader/Writer, FlatFileReader/Writer, FixedWidthReader), config loader, expression evaluator, base pattern class. Patterns: pass_through, truncate_and_load.</w:t>
+            </w:r>
+          </w:p>
+          <w:p>
+            <w:r>
+              <w:rPr>
+                <w:rFonts w:ascii="Arial" w:cs="Arial" w:eastAsia="Arial" w:hAnsi="Arial"/>
+                <w:b/>
+                <w:bCs/>
+                <w:sz w:val="18"/>
+                <w:szCs w:val="18"/>
+              </w:rPr>
+              <w:t>Phase 2 (commit a1a64d7, 127 tests)</w:t>
+            </w:r>
+            <w:r>
+              <w:rPr>
+                <w:rFonts w:ascii="Arial" w:cs="Arial" w:eastAsia="Arial" w:hAnsi="Arial"/>
+                <w:sz w:val="18"/>
+                <w:szCs w:val="18"/>
+              </w:rPr>
+              <w:t xml:space="preserve">  —  incremental_append (watermark-driven delta append, DB + flat-file), expression_transform (column DSL with filter/dedup/sort). Fixed expression DSL comparison operators and WatermarkManager for SQLAlchemy 2.x.</w:t>
+            </w:r>
+          </w:p>
+          <w:p>
+            <w:r>
+              <w:rPr>
+                <w:rFonts w:ascii="Arial" w:cs="Arial" w:eastAsia="Arial" w:hAnsi="Arial"/>
+                <w:b/>
+                <w:bCs/>
+                <w:sz w:val="18"/>
+                <w:szCs w:val="18"/>
+              </w:rPr>
+              <w:t>Phase 3 (commit 5fb0ef5, 160 tests)</w:t>
+            </w:r>
+            <w:r>
+              <w:rPr>
+                <w:rFonts w:ascii="Arial" w:cs="Arial" w:eastAsia="Arial" w:hAnsi="Arial"/>
+                <w:sz w:val="18"/>
+                <w:szCs w:val="18"/>
+              </w:rPr>
+              <w:t xml:space="preserve">  —  upsert (SCD Type 1 merge on business key), scd2 (SCD Type 2 full-history with effective dates and is_current flag), lookup_enrich (N-way reference join with module-level cache). Fixed DatabaseWriter._write_upsert for SQLAlchemy 2.x transaction isolation.</w:t>
+            </w:r>
+          </w:p>
+          <w:p>
+            <w:r>
+              <w:rPr>
+                <w:rFonts w:ascii="Arial" w:cs="Arial" w:eastAsia="Arial" w:hAnsi="Arial"/>
+                <w:b/>
+                <w:bCs/>
+                <w:sz w:val="18"/>
+                <w:szCs w:val="18"/>
+              </w:rPr>
+              <w:t>Phase 4 (commit 4cd4756, 199 tests)</w:t>
+            </w:r>
+            <w:r>
+              <w:rPr>
+                <w:rFonts w:ascii="Arial" w:cs="Arial" w:eastAsia="Arial" w:hAnsi="Arial"/>
+                <w:sz w:val="18"/>
+                <w:szCs w:val="18"/>
+              </w:rPr>
+              <w:t xml:space="preserve">  —  aggregation_load (GROUP BY + named aggregations + optional HAVING + sort), filter_and_route (Router: 1 source → N filtered targets with per-target column_map), union_consolidate (Union: N sources → 1 target with per-source column_map, dedup, sort).</w:t>
+            </w:r>
+          </w:p>
+          <w:p>
+            <w:r>
+              <w:rPr>
+                <w:rFonts w:ascii="Arial" w:cs="Arial" w:eastAsia="Arial" w:hAnsi="Arial"/>
+                <w:b/>
+                <w:bCs/>
+                <w:sz w:val="18"/>
+                <w:szCs w:val="18"/>
+              </w:rPr>
+              <w:t>Phase 5 (commit 3b43411)</w:t>
+            </w:r>
+            <w:r>
+              <w:rPr>
+                <w:rFonts w:ascii="Arial" w:cs="Arial" w:eastAsia="Arial" w:hAnsi="Arial"/>
+                <w:sz w:val="18"/>
+                <w:szCs w:val="18"/>
+              </w:rPr>
+              <w:t xml:space="preserve">  —  10-pattern decision tree in classifier_agent._classify_pattern() (Router → filter_and_route; Aggregator → aggregation_load; SCD target name → scd2; etc.); _build_pattern_yaml_skeleton() emits pre-filled YAML from parsed graph. Conversion agent emits config/&lt;slug&gt;.yaml + run.py when pattern confidence ≠ NONE. ComplexityReport extended with suggested_pattern, pattern_confidence, pattern_rationale fields.</w:t>
+            </w:r>
+          </w:p>
+        </w:tc>
+      </w:tr>
+    </w:tbl>
+    <w:p>
+      <w:pPr>
+        <w:spacing w:after="240"/>
+      </w:pPr>
+    </w:p>
+    <w:p>
+      <w:pPr>
+        <w:pBdr>
+          <w:bottom w:val="single" w:color="1A7A4A" w:sz="6" w:space="4"/>
+        </w:pBdr>
+        <w:spacing w:before="320" w:after="160"/>
+      </w:pPr>
+      <w:r>
+        <w:rPr>
+          <w:rFonts w:ascii="Arial" w:cs="Arial" w:eastAsia="Arial" w:hAnsi="Arial"/>
+          <w:b/>
+          <w:bCs/>
+          <w:color w:val="1E3A5F"/>
+          <w:sz w:val="28"/>
+          <w:szCs w:val="28"/>
+        </w:rPr>
+        <w:t xml:space="preserve">v2.15.1 — Security Hardening Patch</w:t>
+      </w:r>
+      <w:r>
+        <w:rPr>
+          <w:rFonts w:ascii="Arial" w:cs="Arial" w:eastAsia="Arial" w:hAnsi="Arial"/>
+          <w:color w:val="6B7280"/>
+          <w:sz w:val="20"/>
+          <w:szCs w:val="20"/>
+        </w:rPr>
+        <w:t xml:space="preserve">  ·  March 10, 2026  ·  no pipeline behaviour changes</w:t>
+      </w:r>
+    </w:p>
+    <w:tbl>
+      <w:tblPr>
+        <w:tblStyle w:val="TableGrid"/>
+        <w:tblW w:type="dxa" w:w="9360"/>
+        <w:tblBorders>
+          <w:top w:val="none" w:sz="0" w:space="0" w:color="auto"/>
+          <w:left w:val="none" w:sz="0" w:space="0" w:color="auto"/>
+          <w:bottom w:val="none" w:sz="0" w:space="0" w:color="auto"/>
+          <w:right w:val="none" w:sz="0" w:space="0" w:color="auto"/>
+          <w:insideH w:val="single" w:sz="4" w:space="0" w:color="E5E7EB"/>
+          <w:insideV w:val="none" w:sz="0" w:space="0" w:color="auto"/>
+        </w:tblBorders>
+        <w:tblCellMar>
+          <w:top w:type="dxa" w:w="80"/>
+          <w:left w:type="dxa" w:w="120"/>
+          <w:bottom w:type="dxa" w:w="80"/>
+          <w:right w:type="dxa" w:w="120"/>
+        </w:tblCellMar>
+      </w:tblPr>
+      <w:tblGrid>
+        <w:gridCol w:w="1200"/>
+        <w:gridCol w:w="8160"/>
+      </w:tblGrid>
+      <w:tr>
+        <w:tc>
+          <w:tcPr>
+            <w:tcW w:type="dxa" w:w="1200"/>
+            <w:shd w:val="clear" w:color="auto" w:fill="FFF7ED"/>
+            <w:tcMar>
+              <w:top w:type="dxa" w:w="80"/>
+              <w:left w:type="dxa" w:w="120"/>
+              <w:bottom w:type="dxa" w:w="80"/>
+              <w:right w:type="dxa" w:w="120"/>
+            </w:tcMar>
+          </w:tcPr>
+          <w:p>
+            <w:r>
+              <w:rPr>
+                <w:rFonts w:ascii="Arial" w:cs="Arial" w:eastAsia="Arial" w:hAnsi="Arial"/>
+                <w:b/>
+                <w:bCs/>
+                <w:color w:val="92400E"/>
+                <w:sz w:val="18"/>
+                <w:szCs w:val="18"/>
+              </w:rPr>
+              <w:t>FIX</w:t>
+            </w:r>
+          </w:p>
+        </w:tc>
+        <w:tc>
+          <w:tcPr>
+            <w:tcW w:type="dxa" w:w="8160"/>
+            <w:tcMar>
+              <w:top w:type="dxa" w:w="80"/>
+              <w:left w:type="dxa" w:w="120"/>
+              <w:bottom w:type="dxa" w:w="80"/>
+              <w:right w:type="dxa" w:w="120"/>
+            </w:tcMar>
+          </w:tcPr>
+          <w:p>
+            <w:r>
+              <w:rPr>
+                <w:rFonts w:ascii="Arial" w:cs="Arial" w:eastAsia="Arial" w:hAnsi="Arial"/>
+                <w:b/>
+                <w:bCs/>
+                <w:sz w:val="20"/>
+                <w:szCs w:val="20"/>
+              </w:rPr>
+              <w:t>Six targeted security fixes — no pipeline behaviour changes</w:t>
+            </w:r>
+          </w:p>
+          <w:p>
+            <w:r>
+              <w:rPr>
+                <w:rFonts w:ascii="Arial" w:cs="Arial" w:eastAsia="Arial" w:hAnsi="Arial"/>
+                <w:sz w:val="18"/>
+                <w:szCs w:val="18"/>
+              </w:rPr>
+              <w:t xml:space="preserve">ReDoS fix: _YAML_PLACEHOLDER_RE changed &lt;.+&gt; to &lt;.+?&gt; (non-greedy) to eliminate catastrophic backtracking on adversarial YAML. Rate-limit bypass closed: new _real_client_ip() ignores X-Forwarded-For by default (TRUSTED_PROXY_COUNT=0); set N for nginx/CloudFlare deployments. Health endpoint exception leakage fixed: /api/health returns only “error” on failure, not the raw exception string. __import__ anti-pattern removed: three __import__(“datetime”) usages replaced with top-of-file imports. Authorization model documented in routes.py. .env.example completed with inline explanations for all config variables.</w:t>
             </w:r>
           </w:p>
         </w:tc>

</xml_diff>